<commit_message>
Fixed missing info in document
</commit_message>
<xml_diff>
--- a/Documentation/JAWS error while reading bottom line of window.docx
+++ b/Documentation/JAWS error while reading bottom line of window.docx
@@ -218,15 +218,31 @@
         <w:pStyle w:val="Normal"/>
         <w:bidi w:val="0"/>
         <w:jc w:val="left"/>
-        <w:rPr/>
-      </w:pPr>
-      <w:r>
-        <w:rPr/>
+        <w:rPr>
+          <w:sz w:val="22"/>
+          <w:szCs w:val="22"/>
+        </w:rPr>
+      </w:pPr>
+      <w:r>
+        <w:rPr>
+          <w:sz w:val="22"/>
+          <w:szCs w:val="22"/>
+        </w:rPr>
         <w:t xml:space="preserve"> …</w:t>
       </w:r>
       <w:r>
-        <w:rPr/>
+        <w:rPr>
+          <w:sz w:val="22"/>
+          <w:szCs w:val="22"/>
+        </w:rPr>
         <w:t>JawsSayBottomLineExperiment\bin\Debug\net6.0-windows</w:t>
+      </w:r>
+      <w:r>
+        <w:rPr>
+          <w:sz w:val="22"/>
+          <w:szCs w:val="22"/>
+        </w:rPr>
+        <w:t>\JawsSayBottomLineExperiment.exe</w:t>
       </w:r>
     </w:p>
     <w:p>

</xml_diff>